<commit_message>
Erasmo Carlos: revisão da Parte 2
Co-Authored-By: Claude Opus 5.5 <noreply@anthropic.com>
Claude-Session: https://claude.ai/code/session_01MJjUEEZrxQDEUifKK2vj9g
</commit_message>
<xml_diff>
--- a/roteiros/erasmo-carlos/Erasmo_Parte2.docx
+++ b/roteiros/erasmo-carlos/Erasmo_Parte2.docx
@@ -23,7 +23,7 @@
         <w:rPr>
           <w:color w:val="000000"/>
         </w:rPr>
-        <w:t>Imperial era um caçador de talentos. Andava pelo meio artístico do Rio procurando rapazes que soubessem cantar o rock que chegava dos Estados Unidos. E abriu portas para Erasmo que, sozinho, ele jamais conseguiria abrir.</w:t>
+        <w:t>Imperial era um caçador de talentos. Andava pelo meio artístico do Rio procurando rapazes que soubessem cantar o rock que chegava dos Estados Unidos. E abriu para Erasmo as portas das gravadoras.</w:t>
       </w:r>
     </w:p>
     <w:p>
@@ -87,7 +87,7 @@
         <w:rPr>
           <w:color w:val="000000"/>
         </w:rPr>
-        <w:t>No comando, três apresentadores. Roberto Carlos, a cantora Wanderléa e Erasmo Carlos.</w:t>
+        <w:t>No comando estavam Roberto Carlos e a cantora Wanderléa. E, ao lado deles, Erasmo Carlos.</w:t>
       </w:r>
     </w:p>
     <w:p>
@@ -199,7 +199,7 @@
         <w:rPr>
           <w:color w:val="000000"/>
         </w:rPr>
-        <w:t>Aquelas músicas tinham sido feitas por Erasmo e Roberto juntos. E, na homenagem, o nome de Roberto não apareceu em lugar nenhum.</w:t>
+        <w:t>Aquelas músicas tinham sido feitas por Erasmo e Roberto juntos. E, na homenagem, ninguém citou o nome de Roberto.</w:t>
       </w:r>
     </w:p>
     <w:p>
@@ -223,7 +223,7 @@
         <w:rPr>
           <w:color w:val="000000"/>
         </w:rPr>
-        <w:t>A amizade esfriou. Durante meses, os dois continuaram aparecendo lado a lado na televisão, todos os domingos, apresentando a Jovem Guarda. Sorrindo para as câmeras, com a amizade estremecida longe delas.</w:t>
+        <w:t>A amizade esfriou. Durante meses, os dois continuaram aparecendo lado a lado na televisão, todos os domingos, apresentando a Jovem Guarda. Sorrindo para as câmeras como se nada tivesse acontecido.</w:t>
       </w:r>
     </w:p>
     <w:p>
@@ -343,7 +343,7 @@
         <w:rPr>
           <w:color w:val="C00000"/>
         </w:rPr>
-        <w:t>Pense nisso por um momento. O cantor mais rebelde da Jovem Guarda estava sendo vigiado pelo governo. E, mesmo assim, nada daquilo chegava perto do que ia acontecer dentro da casa dele.</w:t>
+        <w:t>O homem que a ditadura vigiava não fazia ideia de onde estava o perigo de verdade. O perigo estava muito mais perto. Dentro da casa dele.</w:t>
       </w:r>
     </w:p>
     <w:p>
@@ -383,7 +383,7 @@
         <w:rPr>
           <w:color w:val="000000"/>
         </w:rPr>
-        <w:t>Narinha virou mais do que esposa. Virou parceira de Erasmo nas composições. Escreveu com ele músicas que o Brasil ia cantar sem saber de onde vinham.</w:t>
+        <w:t>Narinha virou mais do que esposa. Virou parceira de Erasmo nas composições. Assinou com o marido algumas das músicas que ele gravou.</w:t>
       </w:r>
     </w:p>
     <w:p>
@@ -447,7 +447,7 @@
         <w:rPr>
           <w:color w:val="000000"/>
         </w:rPr>
-        <w:t>E, guardado nele, havia um objeto que pertencia a Erasmo. Ficava ali, guardado.</w:t>
+        <w:t>Nele, Erasmo mantinha um objeto que pertencia só a ele.</w:t>
       </w:r>
     </w:p>
     <w:p>

</xml_diff>